<commit_message>
Entrega final Laboratorio 4
Incluye las mediciones consolidadas de las tres máquinas, el informe de observaciones validado y el PDF final.
</commit_message>
<xml_diff>
--- a/Docs/Observaciones-Lab 4.docx
+++ b/Docs/Observaciones-Lab 4.docx
@@ -9708,7 +9708,7 @@
                 <w:szCs w:val="20"/>
                 <w:lang w:eastAsia="en-US"/>
               </w:rPr>
-              <w:t>1.679</w:t>
+              <w:t>1.579</w:t>
             </w:r>
           </w:p>
         </w:tc>
@@ -10862,7 +10862,7 @@
                 <w:szCs w:val="20"/>
                 <w:lang w:eastAsia="en-US"/>
               </w:rPr>
-              <w:t>1,877</w:t>
+              <w:t>1.877</w:t>
             </w:r>
           </w:p>
         </w:tc>
@@ -11863,7 +11863,7 @@
                 <w:szCs w:val="20"/>
                 <w:lang w:eastAsia="en-US"/>
               </w:rPr>
-              <w:t>0.002</w:t>
+              <w:t>0.001</w:t>
             </w:r>
           </w:p>
         </w:tc>
@@ -11972,7 +11972,7 @@
                 <w:szCs w:val="20"/>
                 <w:lang w:eastAsia="en-US"/>
               </w:rPr>
-              <w:t>0.002</w:t>
+              <w:t>0.001</w:t>
             </w:r>
           </w:p>
         </w:tc>
@@ -13114,7 +13114,7 @@
                 <w:color w:val="000000"/>
                 <w:lang w:eastAsia="en-US"/>
               </w:rPr>
-              <w:t>5.692</w:t>
+              <w:t>5.682</w:t>
             </w:r>
           </w:p>
         </w:tc>
@@ -17996,435 +17996,4 @@
     </a:ext>
   </a:extLst>
 </a:theme>
-</file>
-
-<file path=word/webextensions/taskpanes.xml><?xml version="1.0" encoding="utf-8"?>
-<wetp:taskpanes xmlns:wetp="http://schemas.microsoft.com/office/webextensions/taskpanes/2010/11">
-  <wetp:taskpane dockstate="right" visibility="0" width="350" row="0">
-    <wetp:webextensionref xmlns:r="http://schemas.openxmlformats.org/officeDocument/2006/relationships" r:id="rId1"/>
-  </wetp:taskpane>
-</wetp:taskpanes>
-</file>
-
-<file path=word/webextensions/webextension1.xml><?xml version="1.0" encoding="utf-8"?>
-<we:webextension xmlns:we="http://schemas.microsoft.com/office/webextensions/webextension/2010/11" id="{82EE05C9-A4C1-0040-9E14-9C2CB8D2F2F0}">
-  <we:reference id="WA200010453" version="1.0.0.1" store="Omex" storeType="OMEX"/>
-  <we:alternateReferences>
-    <we:reference id="WA200010453" version="1.0.0.1" store="WA200010453" storeType="OMEX"/>
-  </we:alternateReferences>
-  <we:properties>
-    <we:property name="claude.fileId" value="&quot;42bec21a-8068-490c-9252-abec38229f5c&quot;"/>
-  </we:properties>
-  <we:bindings/>
-  <we:snapshot xmlns:r="http://schemas.openxmlformats.org/officeDocument/2006/relationships"/>
-</we:webextension>
-</file>
-
-<file path=customXml/item1.xml><?xml version="1.0" encoding="utf-8"?>
-<p:properties xmlns:p="http://schemas.microsoft.com/office/2006/metadata/properties" xmlns:xsi="http://www.w3.org/2001/XMLSchema-instance" xmlns:pc="http://schemas.microsoft.com/office/infopath/2007/PartnerControls">
-  <documentManagement>
-    <SharedWithUsers xmlns="85e30bcc-d76c-4413-8e4d-2dce22fb0743">
-      <UserInfo>
-        <DisplayName>Carlos Andres Lozano Garzon</DisplayName>
-        <AccountId>13</AccountId>
-        <AccountType/>
-      </UserInfo>
-      <UserInfo>
-        <DisplayName>Dario Ernesto Correal Torres</DisplayName>
-        <AccountId>15</AccountId>
-        <AccountType/>
-      </UserInfo>
-      <UserInfo>
-        <DisplayName>Mario  Fernando De la rosa Rosero</DisplayName>
-        <AccountId>16</AccountId>
-        <AccountType/>
-      </UserInfo>
-      <UserInfo>
-        <DisplayName>Christian Camilo Aparicio Baquen</DisplayName>
-        <AccountId>50</AccountId>
-        <AccountType/>
-      </UserInfo>
-      <UserInfo>
-        <DisplayName>Arturo Henao Chaparro</DisplayName>
-        <AccountId>48</AccountId>
-        <AccountType/>
-      </UserInfo>
-      <UserInfo>
-        <DisplayName>Luis Esteban Florez Salamanca</DisplayName>
-        <AccountId>33</AccountId>
-        <AccountType/>
-      </UserInfo>
-      <UserInfo>
-        <DisplayName>Ivan David Salazar Cardenas</DisplayName>
-        <AccountId>52</AccountId>
-        <AccountType/>
-      </UserInfo>
-      <UserInfo>
-        <DisplayName>Juan Carlos Marin Morales</DisplayName>
-        <AccountId>53</AccountId>
-        <AccountType/>
-      </UserInfo>
-      <UserInfo>
-        <DisplayName>Sofia Duque Gomez</DisplayName>
-        <AccountId>60</AccountId>
-        <AccountType/>
-      </UserInfo>
-      <UserInfo>
-        <DisplayName>Andres Felipe Romero Brand</DisplayName>
-        <AccountId>91</AccountId>
-        <AccountType/>
-      </UserInfo>
-      <UserInfo>
-        <DisplayName>Lindsay Vanessa Pinto Morato</DisplayName>
-        <AccountId>92</AccountId>
-        <AccountType/>
-      </UserInfo>
-      <UserInfo>
-        <DisplayName>Miguel Angel Acosta Walteros</DisplayName>
-        <AccountId>94</AccountId>
-        <AccountType/>
-      </UserInfo>
-      <UserInfo>
-        <DisplayName>Juan David Diaz Ipuz</DisplayName>
-        <AccountId>90</AccountId>
-        <AccountType/>
-      </UserInfo>
-      <UserInfo>
-        <DisplayName>Lily Aitana valentina Duque Chavez</DisplayName>
-        <AccountId>17</AccountId>
-        <AccountType/>
-      </UserInfo>
-      <UserInfo>
-        <DisplayName>Isaac David Bermudez Lara</DisplayName>
-        <AccountId>95</AccountId>
-        <AccountType/>
-      </UserInfo>
-      <UserInfo>
-        <DisplayName>Daniel Alejandro Angel Fuertes</DisplayName>
-        <AccountId>55</AccountId>
-        <AccountType/>
-      </UserInfo>
-      <UserInfo>
-        <DisplayName>Jeniffer Liliam Mendoza Espinosa</DisplayName>
-        <AccountId>97</AccountId>
-        <AccountType/>
-      </UserInfo>
-      <UserInfo>
-        <DisplayName>Kevin Cohen Solano</DisplayName>
-        <AccountId>93</AccountId>
-        <AccountType/>
-      </UserInfo>
-      <UserInfo>
-        <DisplayName>Cesar Luis Moreno Gonzalez</DisplayName>
-        <AccountId>96</AccountId>
-        <AccountType/>
-      </UserInfo>
-      <UserInfo>
-        <DisplayName>Jose Cristobal Arroyo Castellanos</DisplayName>
-        <AccountId>54</AccountId>
-        <AccountType/>
-      </UserInfo>
-    </SharedWithUsers>
-    <TaxCatchAll xmlns="85e30bcc-d76c-4413-8e4d-2dce22fb0743" xsi:nil="true"/>
-    <lcf76f155ced4ddcb4097134ff3c332f xmlns="164883f8-7691-4ecf-b54a-664c0d0edefe">
-      <Terms xmlns="http://schemas.microsoft.com/office/infopath/2007/PartnerControls"/>
-    </lcf76f155ced4ddcb4097134ff3c332f>
-  </documentManagement>
-</p:properties>
-</file>
-
-<file path=customXml/item2.xml><?xml version="1.0" encoding="utf-8"?>
-<ct:contentTypeSchema xmlns:ct="http://schemas.microsoft.com/office/2006/metadata/contentType" xmlns:ma="http://schemas.microsoft.com/office/2006/metadata/properties/metaAttributes" ct:_="" ma:_="" ma:contentTypeName="Documento" ma:contentTypeID="0x01010023858CF01A2EF24688B692775F4C60A4" ma:contentTypeVersion="17" ma:contentTypeDescription="Crear nuevo documento." ma:contentTypeScope="" ma:versionID="af74a0f8eb440a60883e9dd833f0742f">
-  <xsd:schema xmlns:xsd="http://www.w3.org/2001/XMLSchema" xmlns:xs="http://www.w3.org/2001/XMLSchema" xmlns:p="http://schemas.microsoft.com/office/2006/metadata/properties" xmlns:ns2="164883f8-7691-4ecf-b54a-664c0d0edefe" xmlns:ns3="85e30bcc-d76c-4413-8e4d-2dce22fb0743" targetNamespace="http://schemas.microsoft.com/office/2006/metadata/properties" ma:root="true" ma:fieldsID="f5ceeff32ffca1089660572a8ebd1782" ns2:_="" ns3:_="">
-    <xsd:import namespace="164883f8-7691-4ecf-b54a-664c0d0edefe"/>
-    <xsd:import namespace="85e30bcc-d76c-4413-8e4d-2dce22fb0743"/>
-    <xsd:element name="properties">
-      <xsd:complexType>
-        <xsd:sequence>
-          <xsd:element name="documentManagement">
-            <xsd:complexType>
-              <xsd:all>
-                <xsd:element ref="ns2:MediaServiceMetadata" minOccurs="0"/>
-                <xsd:element ref="ns2:MediaServiceFastMetadata" minOccurs="0"/>
-                <xsd:element ref="ns3:SharedWithUsers" minOccurs="0"/>
-                <xsd:element ref="ns3:SharedWithDetails" minOccurs="0"/>
-                <xsd:element ref="ns2:MediaServiceAutoTags" minOccurs="0"/>
-                <xsd:element ref="ns2:MediaServiceGenerationTime" minOccurs="0"/>
-                <xsd:element ref="ns2:MediaServiceEventHashCode" minOccurs="0"/>
-                <xsd:element ref="ns2:MediaServiceOCR" minOccurs="0"/>
-                <xsd:element ref="ns2:MediaServiceDateTaken" minOccurs="0"/>
-                <xsd:element ref="ns2:MediaServiceAutoKeyPoints" minOccurs="0"/>
-                <xsd:element ref="ns2:MediaServiceKeyPoints" minOccurs="0"/>
-                <xsd:element ref="ns2:MediaLengthInSeconds" minOccurs="0"/>
-                <xsd:element ref="ns2:lcf76f155ced4ddcb4097134ff3c332f" minOccurs="0"/>
-                <xsd:element ref="ns3:TaxCatchAll" minOccurs="0"/>
-                <xsd:element ref="ns2:MediaServiceObjectDetectorVersions" minOccurs="0"/>
-                <xsd:element ref="ns2:MediaServiceSearchProperties" minOccurs="0"/>
-              </xsd:all>
-            </xsd:complexType>
-          </xsd:element>
-        </xsd:sequence>
-      </xsd:complexType>
-    </xsd:element>
-  </xsd:schema>
-  <xsd:schema xmlns:xsd="http://www.w3.org/2001/XMLSchema" xmlns:xs="http://www.w3.org/2001/XMLSchema" xmlns:dms="http://schemas.microsoft.com/office/2006/documentManagement/types" xmlns:pc="http://schemas.microsoft.com/office/infopath/2007/PartnerControls" targetNamespace="164883f8-7691-4ecf-b54a-664c0d0edefe" elementFormDefault="qualified">
-    <xsd:import namespace="http://schemas.microsoft.com/office/2006/documentManagement/types"/>
-    <xsd:import namespace="http://schemas.microsoft.com/office/infopath/2007/PartnerControls"/>
-    <xsd:element name="MediaServiceMetadata" ma:index="8" nillable="true" ma:displayName="MediaServiceMetadata" ma:hidden="true" ma:internalName="MediaServiceMetadata" ma:readOnly="true">
-      <xsd:simpleType>
-        <xsd:restriction base="dms:Note"/>
-      </xsd:simpleType>
-    </xsd:element>
-    <xsd:element name="MediaServiceFastMetadata" ma:index="9" nillable="true" ma:displayName="MediaServiceFastMetadata" ma:hidden="true" ma:internalName="MediaServiceFastMetadata" ma:readOnly="true">
-      <xsd:simpleType>
-        <xsd:restriction base="dms:Note"/>
-      </xsd:simpleType>
-    </xsd:element>
-    <xsd:element name="MediaServiceAutoTags" ma:index="12" nillable="true" ma:displayName="Tags" ma:internalName="MediaServiceAutoTags" ma:readOnly="true">
-      <xsd:simpleType>
-        <xsd:restriction base="dms:Text"/>
-      </xsd:simpleType>
-    </xsd:element>
-    <xsd:element name="MediaServiceGenerationTime" ma:index="13" nillable="true" ma:displayName="MediaServiceGenerationTime" ma:hidden="true" ma:internalName="MediaServiceGenerationTime" ma:readOnly="true">
-      <xsd:simpleType>
-        <xsd:restriction base="dms:Text"/>
-      </xsd:simpleType>
-    </xsd:element>
-    <xsd:element name="MediaServiceEventHashCode" ma:index="14" nillable="true" ma:displayName="MediaServiceEventHashCode" ma:hidden="true" ma:internalName="MediaServiceEventHashCode" ma:readOnly="true">
-      <xsd:simpleType>
-        <xsd:restriction base="dms:Text"/>
-      </xsd:simpleType>
-    </xsd:element>
-    <xsd:element name="MediaServiceOCR" ma:index="15" nillable="true" ma:displayName="Extracted Text" ma:internalName="MediaServiceOCR" ma:readOnly="true">
-      <xsd:simpleType>
-        <xsd:restriction base="dms:Note">
-          <xsd:maxLength value="255"/>
-        </xsd:restriction>
-      </xsd:simpleType>
-    </xsd:element>
-    <xsd:element name="MediaServiceDateTaken" ma:index="16" nillable="true" ma:displayName="MediaServiceDateTaken" ma:hidden="true" ma:internalName="MediaServiceDateTaken" ma:readOnly="true">
-      <xsd:simpleType>
-        <xsd:restriction base="dms:Text"/>
-      </xsd:simpleType>
-    </xsd:element>
-    <xsd:element name="MediaServiceAutoKeyPoints" ma:index="17" nillable="true" ma:displayName="MediaServiceAutoKeyPoints" ma:hidden="true" ma:internalName="MediaServiceAutoKeyPoints" ma:readOnly="true">
-      <xsd:simpleType>
-        <xsd:restriction base="dms:Note"/>
-      </xsd:simpleType>
-    </xsd:element>
-    <xsd:element name="MediaServiceKeyPoints" ma:index="18" nillable="true" ma:displayName="KeyPoints" ma:internalName="MediaServiceKeyPoints" ma:readOnly="true">
-      <xsd:simpleType>
-        <xsd:restriction base="dms:Note">
-          <xsd:maxLength value="255"/>
-        </xsd:restriction>
-      </xsd:simpleType>
-    </xsd:element>
-    <xsd:element name="MediaLengthInSeconds" ma:index="19" nillable="true" ma:displayName="Length (seconds)" ma:internalName="MediaLengthInSeconds" ma:readOnly="true">
-      <xsd:simpleType>
-        <xsd:restriction base="dms:Unknown"/>
-      </xsd:simpleType>
-    </xsd:element>
-    <xsd:element name="lcf76f155ced4ddcb4097134ff3c332f" ma:index="21" nillable="true" ma:taxonomy="true" ma:internalName="lcf76f155ced4ddcb4097134ff3c332f" ma:taxonomyFieldName="MediaServiceImageTags" ma:displayName="Etiquetas de imagen" ma:readOnly="false" ma:fieldId="{5cf76f15-5ced-4ddc-b409-7134ff3c332f}" ma:taxonomyMulti="true" ma:sspId="a38e7027-190f-4f90-8839-9f8250567d86" ma:termSetId="09814cd3-568e-fe90-9814-8d621ff8fb84" ma:anchorId="fba54fb3-c3e1-fe81-a776-ca4b69148c4d" ma:open="true" ma:isKeyword="false">
-      <xsd:complexType>
-        <xsd:sequence>
-          <xsd:element ref="pc:Terms" minOccurs="0" maxOccurs="1"/>
-        </xsd:sequence>
-      </xsd:complexType>
-    </xsd:element>
-    <xsd:element name="MediaServiceObjectDetectorVersions" ma:index="23" nillable="true" ma:displayName="MediaServiceObjectDetectorVersions" ma:description="" ma:hidden="true" ma:indexed="true" ma:internalName="MediaServiceObjectDetectorVersions" ma:readOnly="true">
-      <xsd:simpleType>
-        <xsd:restriction base="dms:Text"/>
-      </xsd:simpleType>
-    </xsd:element>
-    <xsd:element name="MediaServiceSearchProperties" ma:index="24" nillable="true" ma:displayName="MediaServiceSearchProperties" ma:hidden="true" ma:internalName="MediaServiceSearchProperties" ma:readOnly="true">
-      <xsd:simpleType>
-        <xsd:restriction base="dms:Note"/>
-      </xsd:simpleType>
-    </xsd:element>
-  </xsd:schema>
-  <xsd:schema xmlns:xsd="http://www.w3.org/2001/XMLSchema" xmlns:xs="http://www.w3.org/2001/XMLSchema" xmlns:dms="http://schemas.microsoft.com/office/2006/documentManagement/types" xmlns:pc="http://schemas.microsoft.com/office/infopath/2007/PartnerControls" targetNamespace="85e30bcc-d76c-4413-8e4d-2dce22fb0743" elementFormDefault="qualified">
-    <xsd:import namespace="http://schemas.microsoft.com/office/2006/documentManagement/types"/>
-    <xsd:import namespace="http://schemas.microsoft.com/office/infopath/2007/PartnerControls"/>
-    <xsd:element name="SharedWithUsers" ma:index="10" nillable="true" ma:displayName="Compartido con" ma:internalName="SharedWithUsers" ma:readOnly="true">
-      <xsd:complexType>
-        <xsd:complexContent>
-          <xsd:extension base="dms:UserMulti">
-            <xsd:sequence>
-              <xsd:element name="UserInfo" minOccurs="0" maxOccurs="unbounded">
-                <xsd:complexType>
-                  <xsd:sequence>
-                    <xsd:element name="DisplayName" type="xsd:string" minOccurs="0"/>
-                    <xsd:element name="AccountId" type="dms:UserId" minOccurs="0" nillable="true"/>
-                    <xsd:element name="AccountType" type="xsd:string" minOccurs="0"/>
-                  </xsd:sequence>
-                </xsd:complexType>
-              </xsd:element>
-            </xsd:sequence>
-          </xsd:extension>
-        </xsd:complexContent>
-      </xsd:complexType>
-    </xsd:element>
-    <xsd:element name="SharedWithDetails" ma:index="11" nillable="true" ma:displayName="Detalles de uso compartido" ma:internalName="SharedWithDetails" ma:readOnly="true">
-      <xsd:simpleType>
-        <xsd:restriction base="dms:Note">
-          <xsd:maxLength value="255"/>
-        </xsd:restriction>
-      </xsd:simpleType>
-    </xsd:element>
-    <xsd:element name="TaxCatchAll" ma:index="22" nillable="true" ma:displayName="Taxonomy Catch All Column" ma:hidden="true" ma:list="{26816d37-b675-4589-8225-e6a38877c704}" ma:internalName="TaxCatchAll" ma:showField="CatchAllData" ma:web="85e30bcc-d76c-4413-8e4d-2dce22fb0743">
-      <xsd:complexType>
-        <xsd:complexContent>
-          <xsd:extension base="dms:MultiChoiceLookup">
-            <xsd:sequence>
-              <xsd:element name="Value" type="dms:Lookup" maxOccurs="unbounded" minOccurs="0" nillable="true"/>
-            </xsd:sequence>
-          </xsd:extension>
-        </xsd:complexContent>
-      </xsd:complexType>
-    </xsd:element>
-  </xsd:schema>
-  <xsd:schema xmlns="http://schemas.openxmlformats.org/package/2006/metadata/core-properties" xmlns:xsd="http://www.w3.org/2001/XMLSchema" xmlns:xsi="http://www.w3.org/2001/XMLSchema-instance" xmlns:dc="http://purl.org/dc/elements/1.1/" xmlns:dcterms="http://purl.org/dc/terms/" xmlns:odoc="http://schemas.microsoft.com/internal/obd" targetNamespace="http://schemas.openxmlformats.org/package/2006/metadata/core-properties" elementFormDefault="qualified" attributeFormDefault="unqualified" blockDefault="#all">
-    <xsd:import namespace="http://purl.org/dc/elements/1.1/" schemaLocation="http://dublincore.org/schemas/xmls/qdc/2003/04/02/dc.xsd"/>
-    <xsd:import namespace="http://purl.org/dc/terms/" schemaLocation="http://dublincore.org/schemas/xmls/qdc/2003/04/02/dcterms.xsd"/>
-    <xsd:element name="coreProperties" type="CT_coreProperties"/>
-    <xsd:complexType name="CT_coreProperties">
-      <xsd:all>
-        <xsd:element ref="dc:creator" minOccurs="0" maxOccurs="1"/>
-        <xsd:element ref="dcterms:created" minOccurs="0" maxOccurs="1"/>
-        <xsd:element ref="dc:identifier" minOccurs="0" maxOccurs="1"/>
-        <xsd:element name="contentType" minOccurs="0" maxOccurs="1" type="xsd:string" ma:index="0" ma:displayName="Tipo de contenido"/>
-        <xsd:element ref="dc:title" minOccurs="0" maxOccurs="1" ma:index="4" ma:displayName="Título"/>
-        <xsd:element ref="dc:subject" minOccurs="0" maxOccurs="1"/>
-        <xsd:element ref="dc:description" minOccurs="0" maxOccurs="1"/>
-        <xsd:element name="keywords" minOccurs="0" maxOccurs="1" type="xsd:string"/>
-        <xsd:element ref="dc:language" minOccurs="0" maxOccurs="1"/>
-        <xsd:element name="category" minOccurs="0" maxOccurs="1" type="xsd:string"/>
-        <xsd:element name="version" minOccurs="0" maxOccurs="1" type="xsd:string"/>
-        <xsd:element name="revision" minOccurs="0" maxOccurs="1" type="xsd:string">
-          <xsd:annotation>
-            <xsd:documentation>
-                        This value indicates the number of saves or revisions. The application is responsible for updating this value after each revision.
-                    </xsd:documentation>
-          </xsd:annotation>
-        </xsd:element>
-        <xsd:element name="lastModifiedBy" minOccurs="0" maxOccurs="1" type="xsd:string"/>
-        <xsd:element ref="dcterms:modified" minOccurs="0" maxOccurs="1"/>
-        <xsd:element name="contentStatus" minOccurs="0" maxOccurs="1" type="xsd:string"/>
-      </xsd:all>
-    </xsd:complexType>
-  </xsd:schema>
-  <xs:schema xmlns:pc="http://schemas.microsoft.com/office/infopath/2007/PartnerControls" xmlns:xs="http://www.w3.org/2001/XMLSchema" targetNamespace="http://schemas.microsoft.com/office/infopath/2007/PartnerControls" elementFormDefault="qualified" attributeFormDefault="unqualified">
-    <xs:element name="Person">
-      <xs:complexType>
-        <xs:sequence>
-          <xs:element ref="pc:DisplayName" minOccurs="0"/>
-          <xs:element ref="pc:AccountId" minOccurs="0"/>
-          <xs:element ref="pc:AccountType" minOccurs="0"/>
-        </xs:sequence>
-      </xs:complexType>
-    </xs:element>
-    <xs:element name="DisplayName" type="xs:string"/>
-    <xs:element name="AccountId" type="xs:string"/>
-    <xs:element name="AccountType" type="xs:string"/>
-    <xs:element name="BDCAssociatedEntity">
-      <xs:complexType>
-        <xs:sequence>
-          <xs:element ref="pc:BDCEntity" minOccurs="0" maxOccurs="unbounded"/>
-        </xs:sequence>
-        <xs:attribute ref="pc:EntityNamespace"/>
-        <xs:attribute ref="pc:EntityName"/>
-        <xs:attribute ref="pc:SystemInstanceName"/>
-        <xs:attribute ref="pc:AssociationName"/>
-      </xs:complexType>
-    </xs:element>
-    <xs:attribute name="EntityNamespace" type="xs:string"/>
-    <xs:attribute name="EntityName" type="xs:string"/>
-    <xs:attribute name="SystemInstanceName" type="xs:string"/>
-    <xs:attribute name="AssociationName" type="xs:string"/>
-    <xs:element name="BDCEntity">
-      <xs:complexType>
-        <xs:sequence>
-          <xs:element ref="pc:EntityDisplayName" minOccurs="0"/>
-          <xs:element ref="pc:EntityInstanceReference" minOccurs="0"/>
-          <xs:element ref="pc:EntityId1" minOccurs="0"/>
-          <xs:element ref="pc:EntityId2" minOccurs="0"/>
-          <xs:element ref="pc:EntityId3" minOccurs="0"/>
-          <xs:element ref="pc:EntityId4" minOccurs="0"/>
-          <xs:element ref="pc:EntityId5" minOccurs="0"/>
-        </xs:sequence>
-      </xs:complexType>
-    </xs:element>
-    <xs:element name="EntityDisplayName" type="xs:string"/>
-    <xs:element name="EntityInstanceReference" type="xs:string"/>
-    <xs:element name="EntityId1" type="xs:string"/>
-    <xs:element name="EntityId2" type="xs:string"/>
-    <xs:element name="EntityId3" type="xs:string"/>
-    <xs:element name="EntityId4" type="xs:string"/>
-    <xs:element name="EntityId5" type="xs:string"/>
-    <xs:element name="Terms">
-      <xs:complexType>
-        <xs:sequence>
-          <xs:element ref="pc:TermInfo" minOccurs="0" maxOccurs="unbounded"/>
-        </xs:sequence>
-      </xs:complexType>
-    </xs:element>
-    <xs:element name="TermInfo">
-      <xs:complexType>
-        <xs:sequence>
-          <xs:element ref="pc:TermName" minOccurs="0"/>
-          <xs:element ref="pc:TermId" minOccurs="0"/>
-        </xs:sequence>
-      </xs:complexType>
-    </xs:element>
-    <xs:element name="TermName" type="xs:string"/>
-    <xs:element name="TermId" type="xs:string"/>
-  </xs:schema>
-</ct:contentTypeSchema>
-</file>
-
-<file path=customXml/item3.xml><?xml version="1.0" encoding="utf-8"?>
-<?mso-contentType ?>
-<FormTemplates xmlns="http://schemas.microsoft.com/sharepoint/v3/contenttype/forms">
-  <Display>DocumentLibraryForm</Display>
-  <Edit>DocumentLibraryForm</Edit>
-  <New>DocumentLibraryForm</New>
-</FormTemplates>
-</file>
-
-<file path=customXml/itemProps1.xml><?xml version="1.0" encoding="utf-8"?>
-<ds:datastoreItem xmlns:ds="http://schemas.openxmlformats.org/officeDocument/2006/customXml" ds:itemID="{D8D55360-DA4E-4EE6-A532-0D8BE99E30A4}">
-  <ds:schemaRefs>
-    <ds:schemaRef ds:uri="http://schemas.microsoft.com/office/2006/metadata/properties"/>
-    <ds:schemaRef ds:uri="http://schemas.microsoft.com/office/infopath/2007/PartnerControls"/>
-    <ds:schemaRef ds:uri="85e30bcc-d76c-4413-8e4d-2dce22fb0743"/>
-    <ds:schemaRef ds:uri="164883f8-7691-4ecf-b54a-664c0d0edefe"/>
-  </ds:schemaRefs>
-</ds:datastoreItem>
-</file>
-
-<file path=customXml/itemProps2.xml><?xml version="1.0" encoding="utf-8"?>
-<ds:datastoreItem xmlns:ds="http://schemas.openxmlformats.org/officeDocument/2006/customXml" ds:itemID="{2739CADD-65E0-4850-8836-FEEF9E729EC2}">
-  <ds:schemaRefs>
-    <ds:schemaRef ds:uri="http://schemas.microsoft.com/office/2006/metadata/contentType"/>
-    <ds:schemaRef ds:uri="http://schemas.microsoft.com/office/2006/metadata/properties/metaAttributes"/>
-    <ds:schemaRef ds:uri="http://www.w3.org/2001/XMLSchema"/>
-    <ds:schemaRef ds:uri="http://schemas.microsoft.com/office/2006/metadata/properties"/>
-    <ds:schemaRef ds:uri="164883f8-7691-4ecf-b54a-664c0d0edefe"/>
-    <ds:schemaRef ds:uri="85e30bcc-d76c-4413-8e4d-2dce22fb0743"/>
-    <ds:schemaRef ds:uri="http://schemas.microsoft.com/office/2006/documentManagement/types"/>
-    <ds:schemaRef ds:uri="http://schemas.microsoft.com/office/infopath/2007/PartnerControls"/>
-    <ds:schemaRef ds:uri="http://schemas.openxmlformats.org/package/2006/metadata/core-properties"/>
-    <ds:schemaRef ds:uri="http://purl.org/dc/elements/1.1/"/>
-    <ds:schemaRef ds:uri="http://purl.org/dc/terms/"/>
-    <ds:schemaRef ds:uri="http://schemas.microsoft.com/internal/obd"/>
-  </ds:schemaRefs>
-</ds:datastoreItem>
-</file>
-
-<file path=customXml/itemProps3.xml><?xml version="1.0" encoding="utf-8"?>
-<ds:datastoreItem xmlns:ds="http://schemas.openxmlformats.org/officeDocument/2006/customXml" ds:itemID="{7DBE8262-9C92-4A1B-85FF-A533173B85D6}">
-  <ds:schemaRefs>
-    <ds:schemaRef ds:uri="http://schemas.microsoft.com/sharepoint/v3/contenttype/forms"/>
-  </ds:schemaRefs>
-</ds:datastoreItem>
 </file>
</xml_diff>